<commit_message>
Standard one-page résumé; SIH listed as a team project, not team lead
</commit_message>
<xml_diff>
--- a/Thirth_Patel_Resume.docx
+++ b/Thirth_Patel_Resume.docx
@@ -10,21 +10,9 @@
       <w:r>
         <w:rPr>
           <w:b/>
-          <w:sz w:val="40"/>
+          <w:sz w:val="44"/>
         </w:rPr>
         <w:t>Thirth Patel</w:t>
-      </w:r>
-    </w:p>
-    <w:p>
-      <w:pPr>
-        <w:spacing w:after="0" w:before="0"/>
-        <w:jc w:val="center"/>
-      </w:pPr>
-      <w:r>
-        <w:rPr>
-          <w:sz w:val="20"/>
-        </w:rPr>
-        <w:t>Software Engineer  |  AI / ML  |  Backend &amp; Full-Stack  |  B.Tech ISE (AI &amp; Robotics)</w:t>
       </w:r>
     </w:p>
     <w:p>
@@ -34,47 +22,23 @@
       </w:pPr>
       <w:r>
         <w:rPr>
-          <w:sz w:val="18"/>
+          <w:sz w:val="19"/>
         </w:rPr>
-        <w:t>Bengaluru, India  |  thirthpatel2@gmail.com  |  linkedin.com/in/thirth-p-a23aa0339  |  github.com/thirthpatel2-web  |  thirthpatel2-web.github.io</w:t>
+        <w:t>thirthpatel2@gmail.com  |  linkedin.com/in/thirth-p-a23aa0339  |  github.com/thirthpatel2-web  |  thirthpatel2-web.github.io</w:t>
       </w:r>
     </w:p>
     <w:p>
       <w:pPr>
         <w:spacing w:after="40" w:before="120"/>
         <w:pBdr>
-          <w:bottom w:val="single" w:sz="8" w:space="1" w:color="0B3D91"/>
+          <w:bottom w:val="single" w:sz="8" w:space="1" w:color="000000"/>
         </w:pBdr>
       </w:pPr>
       <w:r>
         <w:rPr>
           <w:b/>
-          <w:color w:val="0B3D91"/>
-          <w:sz w:val="20"/>
-        </w:rPr>
-        <w:t>SUMMARY</w:t>
-      </w:r>
-    </w:p>
-    <w:p>
-      <w:pPr>
-        <w:spacing w:after="0" w:before="0"/>
-      </w:pPr>
-      <w:r>
-        <w:t>AI/ML and full-stack software engineer (B.Tech ISE, CGPA 8.82) who ships tested, documented, deployed systems. Team Lead at Smart India Hackathon 2026: built a consent-first government data-interoperability gateway with 187 REST APIs, LLM + RAG legal search and 768 automated tests in CI. Hands-on with Python, FastAPI, PostgreSQL, Docker, React and LLM agents; 2 industry internships. Seeking SDE / AI-ML internships.</w:t>
-      </w:r>
-    </w:p>
-    <w:p>
-      <w:pPr>
-        <w:spacing w:after="40" w:before="120"/>
-        <w:pBdr>
-          <w:bottom w:val="single" w:sz="8" w:space="1" w:color="0B3D91"/>
-        </w:pBdr>
-      </w:pPr>
-      <w:r>
-        <w:rPr>
-          <w:b/>
-          <w:color w:val="0B3D91"/>
-          <w:sz w:val="20"/>
+          <w:color w:val="000000"/>
+          <w:sz w:val="22"/>
         </w:rPr>
         <w:t>EDUCATION</w:t>
       </w:r>
@@ -82,7 +46,7 @@
     <w:p>
       <w:pPr>
         <w:tabs>
-          <w:tab w:pos="10772" w:val="right"/>
+          <w:tab w:pos="10546" w:val="right"/>
         </w:tabs>
         <w:spacing w:after="0" w:before="40"/>
       </w:pPr>
@@ -91,17 +55,17 @@
           <w:b/>
           <w:i w:val="0"/>
         </w:rPr>
-        <w:t>Presidency University, Bengaluru</w:t>
+        <w:t>Presidency University</w:t>
       </w:r>
       <w:r>
         <w:tab/>
-        <w:t>2024 - 2028 (expected)</w:t>
+        <w:t>Bengaluru, India</w:t>
       </w:r>
     </w:p>
     <w:p>
       <w:pPr>
         <w:tabs>
-          <w:tab w:pos="10772" w:val="right"/>
+          <w:tab w:pos="10546" w:val="right"/>
         </w:tabs>
         <w:spacing w:after="0" w:before="0"/>
       </w:pPr>
@@ -110,11 +74,11 @@
           <w:b w:val="0"/>
           <w:i/>
         </w:rPr>
-        <w:t>B.Tech, Information Science &amp; Engineering (AI &amp; Robotics)</w:t>
+        <w:t>Bachelor of Technology in Information Science &amp; Engineering (AI &amp; Robotics); CGPA: 8.82 / 10</w:t>
       </w:r>
       <w:r>
         <w:tab/>
-        <w:t>CGPA: 8.82 / 10</w:t>
+        <w:t>2024 - 2028</w:t>
       </w:r>
     </w:p>
     <w:p>
@@ -122,21 +86,21 @@
         <w:spacing w:after="0" w:before="0"/>
       </w:pPr>
       <w:r>
-        <w:t>Coursework: Data Structures &amp; Algorithms, Object-Oriented Programming, Database Management Systems, Operating Systems, Computer Networks, Web Technologies, Artificial Intelligence</w:t>
+        <w:t>Relevant Coursework: Data Structures &amp; Algorithms, Object-Oriented Programming, Database Management Systems, Operating Systems, Computer Networks, Artificial Intelligence, Web Technologies</w:t>
       </w:r>
     </w:p>
     <w:p>
       <w:pPr>
         <w:spacing w:after="40" w:before="120"/>
         <w:pBdr>
-          <w:bottom w:val="single" w:sz="8" w:space="1" w:color="0B3D91"/>
+          <w:bottom w:val="single" w:sz="8" w:space="1" w:color="000000"/>
         </w:pBdr>
       </w:pPr>
       <w:r>
         <w:rPr>
           <w:b/>
-          <w:color w:val="0B3D91"/>
-          <w:sz w:val="20"/>
+          <w:color w:val="000000"/>
+          <w:sz w:val="22"/>
         </w:rPr>
         <w:t>EXPERIENCE</w:t>
       </w:r>
@@ -144,7 +108,7 @@
     <w:p>
       <w:pPr>
         <w:tabs>
-          <w:tab w:pos="10772" w:val="right"/>
+          <w:tab w:pos="10546" w:val="right"/>
         </w:tabs>
         <w:spacing w:after="0" w:before="40"/>
       </w:pPr>
@@ -156,15 +120,27 @@
         <w:t>Full-Stack Web Development Intern</w:t>
       </w:r>
       <w:r>
+        <w:tab/>
+        <w:t>Jul 2026 - Sep 2026</w:t>
+      </w:r>
+    </w:p>
+    <w:p>
+      <w:pPr>
+        <w:tabs>
+          <w:tab w:pos="10546" w:val="right"/>
+        </w:tabs>
+        <w:spacing w:after="0" w:before="0"/>
+      </w:pPr>
+      <w:r>
         <w:rPr>
           <w:b w:val="0"/>
-          <w:i w:val="0"/>
+          <w:i/>
         </w:rPr>
-        <w:t xml:space="preserve"> | Technofenatics Solutions LLP (Sattix), Bengaluru</w:t>
+        <w:t>Technofenatics Solutions LLP (Sattix)</w:t>
       </w:r>
       <w:r>
         <w:tab/>
-        <w:t>Jul 2026 - Sep 2026</w:t>
+        <w:t>Bengaluru, India</w:t>
       </w:r>
     </w:p>
     <w:p>
@@ -173,7 +149,7 @@
         <w:spacing w:after="20"/>
       </w:pPr>
       <w:r>
-        <w:t>Shipped features to Shorthand Pro, a live production PHP + SQLite web app, through a ticket-based Agile workflow: made community links admin-configurable via the existing key-value settings store (no code deploy and no database migration needed for future changes).</w:t>
+        <w:t>Shipped features to Shorthand Pro, a live production web application (PHP, SQLite, JavaScript), in a ticket-based Agile team with daily stand-ups and code reviews.</w:t>
       </w:r>
     </w:p>
     <w:p>
@@ -182,7 +158,7 @@
         <w:spacing w:after="20"/>
       </w:pPr>
       <w:r>
-        <w:t>Resolved 2 role-based dashboard UI defects using Chrome DevTools; root-caused one to browser/server caching and fixed it with filemtime() cache busting, now the reusable pattern for CSS releases.</w:t>
+        <w:t>Made community links admin-configurable through the existing key-value settings store, so future changes need no code deployment and no database migration.</w:t>
       </w:r>
     </w:p>
     <w:p>
@@ -191,13 +167,13 @@
         <w:spacing w:after="20"/>
       </w:pPr>
       <w:r>
-        <w:t>Rated "working - continuing" at the mid-internship review (7 of 13 interns) for daily stand-ups and on-time delivery.</w:t>
+        <w:t>Debugged role-based dashboard UI defects with Chrome DevTools; fixed a stale-asset caching bug with filemtime() cache busting, adopted as the team's pattern for CSS releases.</w:t>
       </w:r>
     </w:p>
     <w:p>
       <w:pPr>
         <w:tabs>
-          <w:tab w:pos="10772" w:val="right"/>
+          <w:tab w:pos="10546" w:val="right"/>
         </w:tabs>
         <w:spacing w:after="0" w:before="40"/>
       </w:pPr>
@@ -209,15 +185,27 @@
         <w:t>Web Development Intern</w:t>
       </w:r>
       <w:r>
+        <w:tab/>
+        <w:t>Jan 2026 - Feb 2026</w:t>
+      </w:r>
+    </w:p>
+    <w:p>
+      <w:pPr>
+        <w:tabs>
+          <w:tab w:pos="10546" w:val="right"/>
+        </w:tabs>
+        <w:spacing w:after="0" w:before="0"/>
+      </w:pPr>
+      <w:r>
         <w:rPr>
           <w:b w:val="0"/>
-          <w:i w:val="0"/>
+          <w:i/>
         </w:rPr>
-        <w:t xml:space="preserve"> | Amdox Technologies, Remote</w:t>
+        <w:t>Amdox Technologies</w:t>
       </w:r>
       <w:r>
         <w:tab/>
-        <w:t>Jan 2026 - Feb 2026</w:t>
+        <w:t>Remote</w:t>
       </w:r>
     </w:p>
     <w:p>
@@ -226,21 +214,30 @@
         <w:spacing w:after="20"/>
       </w:pPr>
       <w:r>
-        <w:t>Built JobConnect, a full-stack job portal (Node.js, Express, REST APIs, JWT + bcrypt authentication, role-based access control) with multi-filter job search and a 5-stage hiring pipeline (Applied to Hired).</w:t>
+        <w:t>Built JobConnect, a full-stack job portal with Node.js, Express.js and REST APIs, secured with JWT + bcrypt authentication and role-based access control (RBAC).</w:t>
+      </w:r>
+    </w:p>
+    <w:p>
+      <w:pPr>
+        <w:pStyle w:val="ListBullet"/>
+        <w:spacing w:after="20"/>
+      </w:pPr>
+      <w:r>
+        <w:t>Implemented multi-filter job search and a 5-stage hiring pipeline (Applied, Reviewed, Shortlisted, Hired / Rejected) for recruiters and candidates.</w:t>
       </w:r>
     </w:p>
     <w:p>
       <w:pPr>
         <w:spacing w:after="40" w:before="120"/>
         <w:pBdr>
-          <w:bottom w:val="single" w:sz="8" w:space="1" w:color="0B3D91"/>
+          <w:bottom w:val="single" w:sz="8" w:space="1" w:color="000000"/>
         </w:pBdr>
       </w:pPr>
       <w:r>
         <w:rPr>
           <w:b/>
-          <w:color w:val="0B3D91"/>
-          <w:sz w:val="20"/>
+          <w:color w:val="000000"/>
+          <w:sz w:val="22"/>
         </w:rPr>
         <w:t>PROJECTS</w:t>
       </w:r>
@@ -248,7 +245,7 @@
     <w:p>
       <w:pPr>
         <w:tabs>
-          <w:tab w:pos="10772" w:val="right"/>
+          <w:tab w:pos="10546" w:val="right"/>
         </w:tabs>
         <w:spacing w:after="0" w:before="40"/>
       </w:pPr>
@@ -264,14 +261,14 @@
           <w:b w:val="0"/>
           <w:i w:val="0"/>
         </w:rPr>
-        <w:t xml:space="preserve"> | </w:t>
+        <w:t xml:space="preserve">  |  </w:t>
       </w:r>
       <w:r>
         <w:rPr>
           <w:b w:val="0"/>
           <w:i/>
         </w:rPr>
-        <w:t>Government data-interoperability gateway | Smart India Hackathon 2026, Team Lead</w:t>
+        <w:t>Python, FastAPI, PostgreSQL, Redis, LLM, RAG, Docker, CI/CD</w:t>
       </w:r>
       <w:r>
         <w:tab/>
@@ -280,14 +277,11 @@
     </w:p>
     <w:p>
       <w:pPr>
-        <w:spacing w:after="0" w:before="0"/>
+        <w:pStyle w:val="ListBullet"/>
+        <w:spacing w:after="20"/>
       </w:pPr>
       <w:r>
-        <w:rPr>
-          <w:color w:val="444444"/>
-          <w:sz w:val="17"/>
-        </w:rPr>
-        <w:t>Python, FastAPI, PostgreSQL, pgvector, Redis, NiceGUI, LLM (Groq), Whisper, Docker, GitHub Actions</w:t>
+        <w:t>Developed a consent-based data-sharing gateway for government departments with 187 REST API endpoints, identity resolution, an audit ledger and per-request tracing (Smart India Hackathon 2026 project).</w:t>
       </w:r>
     </w:p>
     <w:p>
@@ -296,7 +290,7 @@
         <w:spacing w:after="20"/>
       </w:pPr>
       <w:r>
-        <w:t>Led the team and architected a gateway where departments reuse verified citizen data only after consent: identity resolution, consent ledger, data-quality rules, schema mapping and per-hop request tracing; delivered 31/34 SIH26129 spec capabilities, 31/31 E2E checks passing.</w:t>
+        <w:t>Built a RAG legal-search module using pgvector semantic search over 38,238 Supreme Court records that only returns answers it can cite; added voice input in 10 Indian languages (Whisper).</w:t>
       </w:r>
     </w:p>
     <w:p>
@@ -305,22 +299,13 @@
         <w:spacing w:after="20"/>
       </w:pPr>
       <w:r>
-        <w:t>Built 187 REST API operations + WebSockets, 50 web screens, voice input (Whisper STT) in 10 Indian languages and a RAG legal analyzer (pgvector semantic search) over 38,238 Supreme Court records that refuses uncited answers.</w:t>
-      </w:r>
-    </w:p>
-    <w:p>
-      <w:pPr>
-        <w:pStyle w:val="ListBullet"/>
-        <w:spacing w:after="20"/>
-      </w:pPr>
-      <w:r>
-        <w:t>Enforced quality with 768 automated tests (unit, integration, end-to-end), ruff, mypy and a GitHub Actions CI/CD pipeline; deployed with Docker Compose + Caddy HTTPS; made the API ~10x faster under load (13 ms/request) by caching a per-request Argon2 hash.</w:t>
+        <w:t>Wrote 768 automated tests (unit, integration, end-to-end) run in a GitHub Actions CI/CD pipeline; made the API ~10x faster under load (13 ms/request) by caching a per-request Argon2 hash.</w:t>
       </w:r>
     </w:p>
     <w:p>
       <w:pPr>
         <w:tabs>
-          <w:tab w:pos="10772" w:val="right"/>
+          <w:tab w:pos="10546" w:val="right"/>
         </w:tabs>
         <w:spacing w:after="0" w:before="40"/>
       </w:pPr>
@@ -336,14 +321,14 @@
           <w:b w:val="0"/>
           <w:i w:val="0"/>
         </w:rPr>
-        <w:t xml:space="preserve"> | </w:t>
+        <w:t xml:space="preserve">  |  </w:t>
       </w:r>
       <w:r>
         <w:rPr>
           <w:b w:val="0"/>
           <w:i/>
         </w:rPr>
-        <w:t>AI-agent benchmark | Meta x Hugging Face OpenEnv Hackathon</w:t>
+        <w:t>Python, LLM Agents, RL, Docker</w:t>
       </w:r>
       <w:r>
         <w:tab/>
@@ -352,14 +337,11 @@
     </w:p>
     <w:p>
       <w:pPr>
-        <w:spacing w:after="0" w:before="0"/>
+        <w:pStyle w:val="ListBullet"/>
+        <w:spacing w:after="20"/>
       </w:pPr>
       <w:r>
-        <w:rPr>
-          <w:color w:val="444444"/>
-          <w:sz w:val="17"/>
-        </w:rPr>
-        <w:t>Python, OpenEnv, LLM agents, Reinforcement Learning, Docker, Hugging Face Spaces</w:t>
+        <w:t>Designed a reinforcement-learning environment where LLM agents act as on-call engineers in a 12-service microservice graph, with deterministic graders, shaped rewards and 3 difficulty levels.</w:t>
       </w:r>
     </w:p>
     <w:p>
@@ -368,13 +350,13 @@
         <w:spacing w:after="20"/>
       </w:pPr>
       <w:r>
-        <w:t>Designed a reinforcement-learning environment where LLM agents act as on-call SREs in a 12-service microservice dependency graph; deterministic graders, shaped rewards, 3 difficulty tiers; deployed on HF Spaces.</w:t>
+        <w:t>Built for the Meta x Hugging Face OpenEnv Hackathon; containerised with Docker and deployed on Hugging Face Spaces.</w:t>
       </w:r>
     </w:p>
     <w:p>
       <w:pPr>
         <w:tabs>
-          <w:tab w:pos="10772" w:val="right"/>
+          <w:tab w:pos="10546" w:val="right"/>
         </w:tabs>
         <w:spacing w:after="0" w:before="40"/>
       </w:pPr>
@@ -390,14 +372,14 @@
           <w:b w:val="0"/>
           <w:i w:val="0"/>
         </w:rPr>
-        <w:t xml:space="preserve"> | </w:t>
+        <w:t xml:space="preserve">  |  </w:t>
       </w:r>
       <w:r>
         <w:rPr>
           <w:b w:val="0"/>
           <w:i/>
         </w:rPr>
-        <w:t>FusionX Hackathon 2026, AI &amp; ML track</w:t>
+        <w:t>Python, FastAPI, WebSockets, Leaflet, LLM</w:t>
       </w:r>
       <w:r>
         <w:tab/>
@@ -406,29 +388,17 @@
     </w:p>
     <w:p>
       <w:pPr>
-        <w:spacing w:after="0" w:before="0"/>
-      </w:pPr>
-      <w:r>
-        <w:rPr>
-          <w:color w:val="444444"/>
-          <w:sz w:val="17"/>
-        </w:rPr>
-        <w:t>Python, FastAPI, WebSockets, Leaflet, Chart.js, LLM (Groq)</w:t>
-      </w:r>
-    </w:p>
-    <w:p>
-      <w:pPr>
         <w:pStyle w:val="ListBullet"/>
         <w:spacing w:after="20"/>
       </w:pPr>
       <w:r>
-        <w:t>Real-time multi-hazard risk scoring (5 hazards, 14 Indian cities) with 72-hour early warnings, evacuation and resource planning, 13 REST endpoints, a WebSocket alert stream and an LLM analyst with rule-based fallback.</w:t>
+        <w:t>Built real-time multi-hazard risk scoring for 5 hazards across 14 Indian cities with 72-hour early warnings, 13 REST endpoints, a WebSocket alert stream and an LLM analyst (FusionX Hackathon 2026).</w:t>
       </w:r>
     </w:p>
     <w:p>
       <w:pPr>
         <w:tabs>
-          <w:tab w:pos="10772" w:val="right"/>
+          <w:tab w:pos="10546" w:val="right"/>
         </w:tabs>
         <w:spacing w:after="0" w:before="40"/>
       </w:pPr>
@@ -444,14 +414,14 @@
           <w:b w:val="0"/>
           <w:i w:val="0"/>
         </w:rPr>
-        <w:t xml:space="preserve"> | </w:t>
+        <w:t xml:space="preserve">  |  </w:t>
       </w:r>
       <w:r>
         <w:rPr>
           <w:b w:val="0"/>
           <w:i/>
         </w:rPr>
-        <w:t>Computer vision</w:t>
+        <w:t>Python, OpenCV, TensorFlow / Keras, Flask</w:t>
       </w:r>
       <w:r>
         <w:tab/>
@@ -460,14 +430,44 @@
     </w:p>
     <w:p>
       <w:pPr>
-        <w:spacing w:after="0" w:before="0"/>
+        <w:pStyle w:val="ListBullet"/>
+        <w:spacing w:after="20"/>
+      </w:pPr>
+      <w:r>
+        <w:t>Built pothole detection and road-condition grading from a single image in ~1 s using OpenCV contour analysis, with automatic switch-over to a Keras CNN model when trained weights are available.</w:t>
+      </w:r>
+    </w:p>
+    <w:p>
+      <w:pPr>
+        <w:tabs>
+          <w:tab w:pos="10546" w:val="right"/>
+        </w:tabs>
+        <w:spacing w:after="0" w:before="40"/>
       </w:pPr>
       <w:r>
         <w:rPr>
-          <w:color w:val="444444"/>
-          <w:sz w:val="17"/>
+          <w:b/>
+          <w:i w:val="0"/>
         </w:rPr>
-        <w:t>Python, OpenCV, Flask, TensorFlow / Keras (CNN)</w:t>
+        <w:t>Signal - AI Resume Analyzer</w:t>
+      </w:r>
+      <w:r>
+        <w:rPr>
+          <w:b w:val="0"/>
+          <w:i w:val="0"/>
+        </w:rPr>
+        <w:t xml:space="preserve">  |  </w:t>
+      </w:r>
+      <w:r>
+        <w:rPr>
+          <w:b w:val="0"/>
+          <w:i/>
+        </w:rPr>
+        <w:t>Python, scikit-learn, NLP, Flask</w:t>
+      </w:r>
+      <w:r>
+        <w:tab/>
+        <w:t>github.com/thirthpatel2-web/AI-Resume_Analyser</w:t>
       </w:r>
     </w:p>
     <w:p>
@@ -476,75 +476,21 @@
         <w:spacing w:after="20"/>
       </w:pPr>
       <w:r>
-        <w:t>Pothole detection and road-condition grading from one image in ~1 s: OpenCV thresholding, morphology and contour filtering to reject shadows and lane marks; auto-switches to a Keras CNN when a trained model exists.</w:t>
-      </w:r>
-    </w:p>
-    <w:p>
-      <w:pPr>
-        <w:tabs>
-          <w:tab w:pos="10772" w:val="right"/>
-        </w:tabs>
-        <w:spacing w:after="0" w:before="40"/>
-      </w:pPr>
-      <w:r>
-        <w:rPr>
-          <w:b/>
-          <w:i w:val="0"/>
-        </w:rPr>
-        <w:t>Signal &amp; EthicaMind</w:t>
-      </w:r>
-      <w:r>
-        <w:rPr>
-          <w:b w:val="0"/>
-          <w:i w:val="0"/>
-        </w:rPr>
-        <w:t xml:space="preserve"> | </w:t>
-      </w:r>
-      <w:r>
-        <w:rPr>
-          <w:b w:val="0"/>
-          <w:i/>
-        </w:rPr>
-        <w:t>Applied NLP and responsible AI</w:t>
-      </w:r>
-      <w:r>
-        <w:tab/>
-        <w:t>github.com/thirthpatel2-web</w:t>
-      </w:r>
-    </w:p>
-    <w:p>
-      <w:pPr>
-        <w:spacing w:after="0" w:before="0"/>
-      </w:pPr>
-      <w:r>
-        <w:rPr>
-          <w:color w:val="444444"/>
-          <w:sz w:val="17"/>
-        </w:rPr>
-        <w:t>Python, scikit-learn, Flask, React, Gemini API</w:t>
-      </w:r>
-    </w:p>
-    <w:p>
-      <w:pPr>
-        <w:pStyle w:val="ListBullet"/>
-        <w:spacing w:after="20"/>
-      </w:pPr>
-      <w:r>
-        <w:t>Signal: NLP resume-to-job matching across 25 roles (TF-IDF + cosine similarity) with skill-gap analysis. EthicaMind: responsible-AI chat with a crisis-safety layer before any LLM call and multi-model failover.</w:t>
+        <w:t>Built resume-to-job matching across 25 roles using TF-IDF and cosine similarity, with skill-gap analysis explaining each score.</w:t>
       </w:r>
     </w:p>
     <w:p>
       <w:pPr>
         <w:spacing w:after="40" w:before="120"/>
         <w:pBdr>
-          <w:bottom w:val="single" w:sz="8" w:space="1" w:color="0B3D91"/>
+          <w:bottom w:val="single" w:sz="8" w:space="1" w:color="000000"/>
         </w:pBdr>
       </w:pPr>
       <w:r>
         <w:rPr>
           <w:b/>
-          <w:color w:val="0B3D91"/>
-          <w:sz w:val="20"/>
+          <w:color w:val="000000"/>
+          <w:sz w:val="22"/>
         </w:rPr>
         <w:t>TECHNICAL SKILLS</w:t>
       </w:r>
@@ -560,7 +506,21 @@
         <w:t xml:space="preserve">Languages: </w:t>
       </w:r>
       <w:r>
-        <w:t>Python, JavaScript, SQL, Java, C++, PHP, HTML/CSS</w:t>
+        <w:t>Python, Java, C++, JavaScript, SQL, PHP, HTML/CSS</w:t>
+      </w:r>
+    </w:p>
+    <w:p>
+      <w:pPr>
+        <w:spacing w:after="0" w:before="0"/>
+      </w:pPr>
+      <w:r>
+        <w:rPr>
+          <w:b/>
+        </w:rPr>
+        <w:t xml:space="preserve">Frameworks &amp; Libraries: </w:t>
+      </w:r>
+      <w:r>
+        <w:t>FastAPI, Flask, Node.js, Express.js, React, scikit-learn, TensorFlow/Keras, OpenCV</w:t>
       </w:r>
     </w:p>
     <w:p>
@@ -574,7 +534,7 @@
         <w:t xml:space="preserve">AI / ML: </w:t>
       </w:r>
       <w:r>
-        <w:t>Machine Learning, Deep Learning, NLP, Computer Vision, LLMs, RAG, Vector Search (pgvector), Embeddings, AI Agents, Reinforcement Learning, scikit-learn, TensorFlow/Keras, OpenCV, Whisper, Ollama, Groq, Gemini</w:t>
+        <w:t>Machine Learning, Deep Learning, NLP, Computer Vision, LLMs, RAG, Vector Search, AI Agents</w:t>
       </w:r>
     </w:p>
     <w:p>
@@ -585,10 +545,10 @@
         <w:rPr>
           <w:b/>
         </w:rPr>
-        <w:t xml:space="preserve">Backend, Web &amp; Data: </w:t>
+        <w:t xml:space="preserve">Databases &amp; Tools: </w:t>
       </w:r>
       <w:r>
-        <w:t>FastAPI, Flask, Node.js, Express, REST APIs, WebSockets, PostgreSQL, Redis, MongoDB, SQLite, Alembic, JWT, React, Vite, NiceGUI, Leaflet, Chart.js, three.js</w:t>
+        <w:t>PostgreSQL, MySQL, MongoDB, Redis, SQLite, Git, GitHub Actions (CI/CD), Docker, Linux, pytest</w:t>
       </w:r>
     </w:p>
     <w:p>
@@ -599,38 +559,24 @@
         <w:rPr>
           <w:b/>
         </w:rPr>
-        <w:t xml:space="preserve">DevOps &amp; Quality: </w:t>
+        <w:t xml:space="preserve">Core CS: </w:t>
       </w:r>
       <w:r>
-        <w:t>Git, GitHub Actions (CI/CD), Docker, Docker Compose, Caddy, Linux, pytest, Playwright, ruff, mypy</w:t>
-      </w:r>
-    </w:p>
-    <w:p>
-      <w:pPr>
-        <w:spacing w:after="0" w:before="0"/>
-      </w:pPr>
-      <w:r>
-        <w:rPr>
-          <w:b/>
-        </w:rPr>
-        <w:t xml:space="preserve">Concepts: </w:t>
-      </w:r>
-      <w:r>
-        <w:t>Data Structures &amp; Algorithms, OOP, DBMS, OS, Computer Networks, System Design, Distributed Systems, Microservices, API Design, Authentication &amp; RBAC, Caching, Testing, Agile/Scrum</w:t>
+        <w:t>Data Structures &amp; Algorithms, OOP, DBMS, Operating Systems, Computer Networks, System Design, REST API Design</w:t>
       </w:r>
     </w:p>
     <w:p>
       <w:pPr>
         <w:spacing w:after="40" w:before="120"/>
         <w:pBdr>
-          <w:bottom w:val="single" w:sz="8" w:space="1" w:color="0B3D91"/>
+          <w:bottom w:val="single" w:sz="8" w:space="1" w:color="000000"/>
         </w:pBdr>
       </w:pPr>
       <w:r>
         <w:rPr>
           <w:b/>
-          <w:color w:val="0B3D91"/>
-          <w:sz w:val="20"/>
+          <w:color w:val="000000"/>
+          <w:sz w:val="22"/>
         </w:rPr>
         <w:t>ACHIEVEMENTS &amp; CERTIFICATIONS</w:t>
       </w:r>
@@ -641,7 +587,7 @@
         <w:spacing w:after="20"/>
       </w:pPr>
       <w:r>
-        <w:t>Smart India Hackathon 2026: Team Lead; Top 142 teams at Presidency University's internal round (CivicLens, SIH26129).</w:t>
+        <w:t>Smart India Hackathon 2026: selected in the Top 142 teams at Presidency University's internal round (CivicLens).</w:t>
       </w:r>
     </w:p>
     <w:p>
@@ -650,7 +596,7 @@
         <w:spacing w:after="20"/>
       </w:pPr>
       <w:r>
-        <w:t>Hackathons: Meta x Hugging Face OpenEnv (Cascade Failure Env), FusionX 2026 (IRIS), Hack Devengers 2.0 (1,500+ entries).</w:t>
+        <w:t>Participated in the Meta x Hugging Face OpenEnv Hackathon, FusionX Hackathon 2026 and Hack Devengers 2.0.</w:t>
       </w:r>
     </w:p>
     <w:p>
@@ -659,12 +605,12 @@
         <w:spacing w:after="20"/>
       </w:pPr>
       <w:r>
-        <w:t>Certifications: Infosys Springboard - Database Fundamentals: Getting Started with SQL, Introduction to MySQL; Corizo - Web Development internship (2026).</w:t>
+        <w:t>Certifications: Infosys Springboard - Database Fundamentals (SQL), Introduction to MySQL; Corizo - Web Development.</w:t>
       </w:r>
     </w:p>
     <w:sectPr>
       <w:pgSz w:w="11906" w:h="16838"/>
-      <w:pgMar w:top="510" w:right="567" w:bottom="454" w:left="567" w:header="720" w:footer="720" w:gutter="0"/>
+      <w:pgMar w:top="567" w:right="680" w:bottom="510" w:left="680" w:header="720" w:footer="720" w:gutter="0"/>
       <w:cols w:space="720"/>
       <w:docGrid w:linePitch="360"/>
     </w:sectPr>
@@ -1040,7 +986,7 @@
     </w:pPr>
     <w:rPr>
       <w:rFonts w:ascii="Calibri" w:hAnsi="Calibri" w:eastAsia="Calibri"/>
-      <w:sz w:val="18"/>
+      <w:sz w:val="20"/>
     </w:rPr>
   </w:style>
   <w:style w:type="paragraph" w:styleId="Header">

</xml_diff>

<commit_message>
CivicLens: credit as primary developer (all 93 commits)
</commit_message>
<xml_diff>
--- a/Thirth_Patel_Resume.docx
+++ b/Thirth_Patel_Resume.docx
@@ -281,7 +281,7 @@
         <w:spacing w:after="20"/>
       </w:pPr>
       <w:r>
-        <w:t>Developed a consent-based data-sharing gateway for government departments with 187 REST API endpoints, identity resolution, an audit ledger and per-request tracing (Smart India Hackathon 2026 project).</w:t>
+        <w:t>Primary developer (authored all 93 commits) of a consent-based data-sharing gateway for government departments: designed the architecture and built 187 REST API endpoints, identity resolution, an audit ledger and request tracing.</w:t>
       </w:r>
     </w:p>
     <w:p>
@@ -587,7 +587,7 @@
         <w:spacing w:after="20"/>
       </w:pPr>
       <w:r>
-        <w:t>Smart India Hackathon 2026: selected in the Top 142 teams at Presidency University's internal round (CivicLens).</w:t>
+        <w:t>Smart India Hackathon 2026: Top 142 teams at the Presidency University internal round; primary developer of CivicLens.</w:t>
       </w:r>
     </w:p>
     <w:p>

</xml_diff>

<commit_message>
Résumé: GitHub and portfolio QR codes, ML & GenAI tools row
</commit_message>
<xml_diff>
--- a/Thirth_Patel_Resume.docx
+++ b/Thirth_Patel_Resume.docx
@@ -2,31 +2,172 @@
 <file path=word/document.xml><?xml version="1.0" encoding="utf-8"?>
 <w:document xmlns:wpc="http://schemas.microsoft.com/office/word/2010/wordprocessingCanvas" xmlns:mo="http://schemas.microsoft.com/office/mac/office/2008/main" xmlns:mc="http://schemas.openxmlformats.org/markup-compatibility/2006" xmlns:mv="urn:schemas-microsoft-com:mac:vml" xmlns:o="urn:schemas-microsoft-com:office:office" xmlns:r="http://schemas.openxmlformats.org/officeDocument/2006/relationships" xmlns:m="http://schemas.openxmlformats.org/officeDocument/2006/math" xmlns:v="urn:schemas-microsoft-com:vml" xmlns:wp14="http://schemas.microsoft.com/office/word/2010/wordprocessingDrawing" xmlns:wp="http://schemas.openxmlformats.org/drawingml/2006/wordprocessingDrawing" xmlns:w10="urn:schemas-microsoft-com:office:word" xmlns:w="http://schemas.openxmlformats.org/wordprocessingml/2006/main" xmlns:w14="http://schemas.microsoft.com/office/word/2010/wordml" xmlns:wpg="http://schemas.microsoft.com/office/word/2010/wordprocessingGroup" xmlns:wpi="http://schemas.microsoft.com/office/word/2010/wordprocessingInk" xmlns:wne="http://schemas.microsoft.com/office/word/2006/wordml" xmlns:wps="http://schemas.microsoft.com/office/word/2010/wordprocessingShape" mc:Ignorable="w14 wp14">
   <w:body>
-    <w:p>
-      <w:pPr>
-        <w:spacing w:after="0" w:before="0"/>
-        <w:jc w:val="center"/>
-      </w:pPr>
-      <w:r>
-        <w:rPr>
-          <w:b/>
-          <w:sz w:val="44"/>
-        </w:rPr>
-        <w:t>Thirth Patel</w:t>
-      </w:r>
-    </w:p>
-    <w:p>
-      <w:pPr>
-        <w:spacing w:after="40" w:before="0"/>
-        <w:jc w:val="center"/>
-      </w:pPr>
-      <w:r>
-        <w:rPr>
-          <w:sz w:val="19"/>
-        </w:rPr>
-        <w:t>thirthpatel2@gmail.com  |  linkedin.com/in/thirth-p-a23aa0339  |  github.com/thirthpatel2-web  |  thirthpatel2-web.github.io</w:t>
-      </w:r>
-    </w:p>
+    <w:tbl>
+      <w:tblPr>
+        <w:tblW w:type="auto" w:w="0"/>
+        <w:tblLayout w:type="fixed"/>
+        <w:tblLook w:firstColumn="1" w:firstRow="1" w:lastColumn="0" w:lastRow="0" w:noHBand="0" w:noVBand="1" w:val="04A0"/>
+      </w:tblPr>
+      <w:tblGrid>
+        <w:gridCol w:w="3515"/>
+        <w:gridCol w:w="3515"/>
+        <w:gridCol w:w="3515"/>
+      </w:tblGrid>
+      <w:tr>
+        <w:tc>
+          <w:tcPr>
+            <w:tcW w:type="dxa" w:w="1247"/>
+            <w:vAlign w:val="center"/>
+          </w:tcPr>
+          <w:p>
+            <w:pPr>
+              <w:jc w:val="center"/>
+            </w:pPr>
+            <w:r>
+              <w:drawing>
+                <wp:inline xmlns:a="http://schemas.openxmlformats.org/drawingml/2006/main" xmlns:pic="http://schemas.openxmlformats.org/drawingml/2006/picture">
+                  <wp:extent cx="540000" cy="540000"/>
+                  <wp:docPr id="1" name="Picture 1"/>
+                  <wp:cNvGraphicFramePr>
+                    <a:graphicFrameLocks noChangeAspect="1"/>
+                  </wp:cNvGraphicFramePr>
+                  <a:graphic>
+                    <a:graphicData uri="http://schemas.openxmlformats.org/drawingml/2006/picture">
+                      <pic:pic>
+                        <pic:nvPicPr>
+                          <pic:cNvPr id="0" name="image.png"/>
+                          <pic:cNvPicPr/>
+                        </pic:nvPicPr>
+                        <pic:blipFill>
+                          <a:blip r:embed="rId9"/>
+                          <a:stretch>
+                            <a:fillRect/>
+                          </a:stretch>
+                        </pic:blipFill>
+                        <pic:spPr>
+                          <a:xfrm>
+                            <a:off x="0" y="0"/>
+                            <a:ext cx="540000" cy="540000"/>
+                          </a:xfrm>
+                          <a:prstGeom prst="rect"/>
+                        </pic:spPr>
+                      </pic:pic>
+                    </a:graphicData>
+                  </a:graphic>
+                </wp:inline>
+              </w:drawing>
+            </w:r>
+          </w:p>
+          <w:p>
+            <w:pPr>
+              <w:jc w:val="center"/>
+            </w:pPr>
+            <w:r>
+              <w:rPr>
+                <w:sz w:val="14"/>
+              </w:rPr>
+              <w:t>GitHub</w:t>
+            </w:r>
+          </w:p>
+        </w:tc>
+        <w:tc>
+          <w:tcPr>
+            <w:tcW w:type="dxa" w:w="8052"/>
+            <w:vAlign w:val="center"/>
+          </w:tcPr>
+          <w:p>
+            <w:pPr>
+              <w:jc w:val="center"/>
+            </w:pPr>
+            <w:r>
+              <w:rPr>
+                <w:b/>
+                <w:sz w:val="44"/>
+              </w:rPr>
+              <w:t>Thirth Patel</w:t>
+            </w:r>
+          </w:p>
+          <w:p>
+            <w:pPr>
+              <w:jc w:val="center"/>
+            </w:pPr>
+            <w:r>
+              <w:rPr>
+                <w:sz w:val="19"/>
+              </w:rPr>
+              <w:t>thirthpatel2@gmail.com  |  linkedin.com/in/thirth-p-a23aa0339  |  github.com/thirthpatel2-web</w:t>
+            </w:r>
+          </w:p>
+          <w:p>
+            <w:pPr>
+              <w:jc w:val="center"/>
+            </w:pPr>
+            <w:r>
+              <w:rPr>
+                <w:sz w:val="19"/>
+              </w:rPr>
+              <w:t>thirthpatel2-web.github.io</w:t>
+            </w:r>
+          </w:p>
+        </w:tc>
+        <w:tc>
+          <w:tcPr>
+            <w:tcW w:type="dxa" w:w="1247"/>
+            <w:vAlign w:val="center"/>
+          </w:tcPr>
+          <w:p>
+            <w:pPr>
+              <w:jc w:val="center"/>
+            </w:pPr>
+            <w:r>
+              <w:drawing>
+                <wp:inline xmlns:a="http://schemas.openxmlformats.org/drawingml/2006/main" xmlns:pic="http://schemas.openxmlformats.org/drawingml/2006/picture">
+                  <wp:extent cx="540000" cy="540000"/>
+                  <wp:docPr id="2" name="Picture 2"/>
+                  <wp:cNvGraphicFramePr>
+                    <a:graphicFrameLocks noChangeAspect="1"/>
+                  </wp:cNvGraphicFramePr>
+                  <a:graphic>
+                    <a:graphicData uri="http://schemas.openxmlformats.org/drawingml/2006/picture">
+                      <pic:pic>
+                        <pic:nvPicPr>
+                          <pic:cNvPr id="0" name="image.png"/>
+                          <pic:cNvPicPr/>
+                        </pic:nvPicPr>
+                        <pic:blipFill>
+                          <a:blip r:embed="rId10"/>
+                          <a:stretch>
+                            <a:fillRect/>
+                          </a:stretch>
+                        </pic:blipFill>
+                        <pic:spPr>
+                          <a:xfrm>
+                            <a:off x="0" y="0"/>
+                            <a:ext cx="540000" cy="540000"/>
+                          </a:xfrm>
+                          <a:prstGeom prst="rect"/>
+                        </pic:spPr>
+                      </pic:pic>
+                    </a:graphicData>
+                  </a:graphic>
+                </wp:inline>
+              </w:drawing>
+            </w:r>
+          </w:p>
+          <w:p>
+            <w:pPr>
+              <w:jc w:val="center"/>
+            </w:pPr>
+            <w:r>
+              <w:rPr>
+                <w:sz w:val="14"/>
+              </w:rPr>
+              <w:t>Portfolio</w:t>
+            </w:r>
+          </w:p>
+        </w:tc>
+      </w:tr>
+    </w:tbl>
     <w:p>
       <w:pPr>
         <w:spacing w:after="40" w:before="120"/>
@@ -517,10 +658,10 @@
         <w:rPr>
           <w:b/>
         </w:rPr>
-        <w:t xml:space="preserve">Frameworks &amp; Libraries: </w:t>
+        <w:t xml:space="preserve">ML &amp; GenAI Tools: </w:t>
       </w:r>
       <w:r>
-        <w:t>FastAPI, Flask, Node.js, Express.js, React, scikit-learn, TensorFlow/Keras, OpenCV</w:t>
+        <w:t>scikit-learn, TensorFlow/Keras, OpenCV, LLMs, RAG, Vector DB (pgvector), AI Agents, NLP, Computer Vision</w:t>
       </w:r>
     </w:p>
     <w:p>
@@ -531,10 +672,10 @@
         <w:rPr>
           <w:b/>
         </w:rPr>
-        <w:t xml:space="preserve">AI / ML: </w:t>
+        <w:t xml:space="preserve">Web Frameworks: </w:t>
       </w:r>
       <w:r>
-        <w:t>Machine Learning, Deep Learning, NLP, Computer Vision, LLMs, RAG, Vector Search, AI Agents</w:t>
+        <w:t>FastAPI, Flask, Node.js, Express.js, React, REST APIs, WebSockets</w:t>
       </w:r>
     </w:p>
     <w:p>
@@ -545,7 +686,7 @@
         <w:rPr>
           <w:b/>
         </w:rPr>
-        <w:t xml:space="preserve">Databases &amp; Tools: </w:t>
+        <w:t xml:space="preserve">Databases &amp; DevOps: </w:t>
       </w:r>
       <w:r>
         <w:t>PostgreSQL, MySQL, MongoDB, Redis, SQLite, Git, GitHub Actions (CI/CD), Docker, Linux, pytest</w:t>
@@ -562,7 +703,7 @@
         <w:t xml:space="preserve">Core CS: </w:t>
       </w:r>
       <w:r>
-        <w:t>Data Structures &amp; Algorithms, OOP, DBMS, Operating Systems, Computer Networks, System Design, REST API Design</w:t>
+        <w:t>Data Structures &amp; Algorithms, OOP, DBMS, Operating Systems, Computer Networks, System Design</w:t>
       </w:r>
     </w:p>
     <w:p>

</xml_diff>

<commit_message>
New LinkedIn URL; résumé adds InnovateX 4.0 3rd place
</commit_message>
<xml_diff>
--- a/Thirth_Patel_Resume.docx
+++ b/Thirth_Patel_Resume.docx
@@ -95,7 +95,7 @@
               <w:rPr>
                 <w:sz w:val="19"/>
               </w:rPr>
-              <w:t>thirthpatel2@gmail.com  |  linkedin.com/in/thirth-p-a23aa0339  |  github.com/thirthpatel2-web</w:t>
+              <w:t>thirthpatel2@gmail.com  |  linkedin.com/in/thirth-patel-a23aa0339  |  github.com/thirthpatel2-web</w:t>
             </w:r>
           </w:p>
           <w:p>
@@ -728,6 +728,15 @@
         <w:spacing w:after="20"/>
       </w:pPr>
       <w:r>
+        <w:t>3rd Place, InnovateX 4.0 AppForge (international tech fest, Presidency University) with CivicLens; Top 5 with EthicaMind.</w:t>
+      </w:r>
+    </w:p>
+    <w:p>
+      <w:pPr>
+        <w:pStyle w:val="ListBullet"/>
+        <w:spacing w:after="20"/>
+      </w:pPr>
+      <w:r>
         <w:t>Smart India Hackathon 2026: Top 142 teams at the Presidency University internal round; primary developer of CivicLens.</w:t>
       </w:r>
     </w:p>
@@ -737,16 +746,7 @@
         <w:spacing w:after="20"/>
       </w:pPr>
       <w:r>
-        <w:t>Participated in the Meta x Hugging Face OpenEnv Hackathon, FusionX Hackathon 2026 and Hack Devengers 2.0.</w:t>
-      </w:r>
-    </w:p>
-    <w:p>
-      <w:pPr>
-        <w:pStyle w:val="ListBullet"/>
-        <w:spacing w:after="20"/>
-      </w:pPr>
-      <w:r>
-        <w:t>Certifications: Infosys Springboard - Database Fundamentals (SQL), Introduction to MySQL; Corizo - Web Development.</w:t>
+        <w:t>Certifications: Infosys Springboard - Database Fundamentals (SQL), Introduction to MySQL; Corizo - Web Development; NoviTech - Data Analytics.</w:t>
       </w:r>
     </w:p>
     <w:sectPr>

</xml_diff>